<commit_message>
MOO-162: carry F-6's cap decision on MOO-179, blocked on MOO-170
Co-Authored-By: Claude Opus 5 <noreply@anthropic.com>
</commit_message>
<xml_diff>
--- a/moo162-disposition.docx
+++ b/moo162-disposition.docx
@@ -2495,7 +2495,16 @@
         <w:t>The decision is mine and I take it when [MOO-170](/MOO/issues/MOO-170)'s chaining answer lands</w:t>
       </w:r>
       <w:r>
-        <w:t xml:space="preserve"> — trigger 1 of the two named at §3.4, unchanged. Trigger 2 is unchanged too: </w:t>
+        <w:t xml:space="preserve"> — trigger 1 of the two named at §3.4, unchanged. </w:t>
+      </w:r>
+      <w:r>
+        <w:rPr>
+          <w:b/>
+        </w:rPr>
+        <w:t>It is carried at [MOO-179](/MOO/issues/MOO-179), blocked on MOO-170</w:t>
+      </w:r>
+      <w:r>
+        <w:t xml:space="preserve">, so the decision wakes on a first-class blocker rather than on my remembering to come back to it. Trigger 2 is unchanged too: </w:t>
       </w:r>
       <w:r>
         <w:rPr>
@@ -2880,6 +2889,12 @@
               </w:rPr>
               <w:t>Policy Director</w:t>
             </w:r>
+            <w:r>
+              <w:t xml:space="preserve">, </w:t>
+            </w:r>
+            <w:r>
+              <w:t>MOO-179</w:t>
+            </w:r>
           </w:p>
         </w:tc>
         <w:tc>
@@ -2888,7 +2903,13 @@
           </w:tcPr>
           <w:p>
             <w:r>
-              <w:t>held, on MOO-170</w:t>
+              <w:rPr>
+                <w:b/>
+              </w:rPr>
+              <w:t>held as a first-class blocker on [MOO-170](/MOO/issues/MOO-170)</w:t>
+            </w:r>
+            <w:r>
+              <w:t>, not as a promise in prose</w:t>
             </w:r>
           </w:p>
         </w:tc>

</xml_diff>